<commit_message>
fix: §3.4 Electoral Commission → Elections Panel of DIC throughout
§3.4 Electoral Districts, §3.4.b LI Redistricting Review,
§3.4.c Territorial District Drawing, §3.4.f District Vacancy:

'Electoral Commission' replaced with 'Elections Panel of the
Digital Infrastructure Commission' throughout all redistricting
provisions. Abbreviated 'EC' references also updated.

Structure confirmed sound:
- States draw their own maps within §3.4.a criteria
- LI verifies compliance only; LI cannot draw maps
- Two-attempt limit before Elections Panel draws interim map
- Interim map is explicitly temporary — retired automatically
  when State submits and LI certifies a compliant map
- States may request advisory consultation from Elections Panel
  at any point; advisory only, does not transfer responsibility
- Territorial elections administered by Elections Panel directly
</commit_message>
<xml_diff>
--- a/constitution-v181.docx
+++ b/constitution-v181.docx
@@ -7814,7 +7814,7 @@
           <w:sz w:val="22"/>
           <w:szCs w:val="22"/>
         </w:rPr>
-        <w:t xml:space="preserve">States draw their own House district maps following each census, subject to compliance review by the Legislative Inspectorate against the criteria established in §3.4.a. Where a State fails repeated review, the Electoral Commission draws an interim compliant map under §3.4.b pending State compliance. A State may request drawing consulting from the EC at any point in the redistricting process; such consulting is advisory and does not transfer the State's map-drawing responsibility to the EC. Territorial district maps are drawn by the Electoral Commission under §3.4.c, subject to the same §3.4.a criteria and LI compliance review. District maps are drawn after each census, every ten years. Emergency redistricting may occur if a State's population changes significantly between census cycles. A State may not redistrict more than once per census cycle without LI approval.</w:t>
+        <w:t xml:space="preserve">States draw their own House district maps following each census, subject to compliance review by the Legislative Inspectorate against the criteria established in §3.4.a. Where a State fails repeated review, the Elections Panel of the Digital Infrastructure Commission draws an interim compliant map under §3.4.b pending State compliance. A State may request drawing consulting from the Elections Panel at any point in the redistricting process; such consulting is advisory and does not transfer the State's map-drawing responsibility to the Elections Panel. Territorial district maps are drawn by the Elections Panel of the Digital Infrastructure Commission under §3.4.c, subject to the same §3.4.a criteria and LI compliance review. District maps are drawn after each census, every ten years. Emergency redistricting may occur if a State's population changes significantly between census cycles. A State may not redistrict more than once per census cycle without LI approval.</w:t>
       </w:r>
     </w:p>
     <w:p>
@@ -7916,7 +7916,7 @@
           <w:sz w:val="22"/>
           <w:szCs w:val="22"/>
         </w:rPr>
-        <w:t xml:space="preserve">The LI reviews all State-drawn district maps within 60 days of submission and publishes its compliance findings to the NRS. If a map fails the §3.4.a criteria, the LI publishes specific findings and the State must submit a corrected map within 30 days. If the corrected map still fails, the Electoral Commission draws an interim compliant map using the §3.4.a criteria, which takes effect at the next election. The EC-drawn interim map is not permanent — it is retired automatically when the State submits and the LI certifies a compliant State-drawn map. Until then, elections proceed on the EC-drawn map. The LI cannot draw district maps; its role is compliance review only. The EC cannot impose a permanent map; its interim map creates an incentive for State compliance, not a substitute for it.</w:t>
+        <w:t xml:space="preserve">The LI reviews all State-drawn district maps within 60 days of submission and publishes its compliance findings to the NRS. If a map fails the §3.4.a criteria, the LI publishes specific findings and the State must submit a corrected map within 30 days. If the corrected map still fails, the Elections Panel of the Digital Infrastructure Commission draws an interim compliant map using the §3.4.a criteria, which takes effect at the next election. The Elections Panel-drawn interim map is not permanent — it is retired automatically when the State submits and the LI certifies a compliant State-drawn map. Until then, elections proceed on the Elections Panel-drawn map. The LI cannot draw district maps; its role is compliance review only. The EC cannot impose a permanent map; its interim map creates an incentive for State compliance, not a substitute for it.</w:t>
       </w:r>
     </w:p>
     <w:p>
@@ -7967,7 +7967,7 @@
           <w:sz w:val="22"/>
           <w:szCs w:val="22"/>
         </w:rPr>
-        <w:t xml:space="preserve">For Territories holding one House seat, the Territory is a single at-large constituency — no district drawing is required and the EC administers the election directly through the NVS. For Territories holding two or more House seats, the Electoral Commission draws district boundaries following each census using the criteria established in §3.4.a. The EC publishes a draft map to the NRS and opens a 60-day public comment period during which the Territory's governing council may submit formal written objections. The EC must respond in writing to each formal objection before publishing a final proposed map. The LI then reviews the final proposed map under §3.4.a standards and publishes its compliance findings to the NRS within 30 days. If the LI finds criteria violations, the EC must revise and republish within 30 days; the LI reviews the revision within 14 days. A map that passes LI review is certified and takes effect at the next general election. The EC administers all Territorial House elections through the NVS on the same schedule as State elections.</w:t>
+        <w:t xml:space="preserve">For Territories holding one House seat, the Territory is a single at-large constituency — no district drawing is required and the Elections Panel administers the election directly through the NVS. For Territories holding two or more House seats, the Elections Panel of the Digital Infrastructure Commission draws district boundaries following each census using the criteria established in §3.4.a. The EC publishes a draft map to the NRS and opens a 60-day public comment period during which the Territory's governing council may submit formal written objections. The EC must respond in writing to each formal objection before publishing a final proposed map. The LI then reviews the final proposed map under §3.4.a standards and publishes its compliance findings to the NRS within 30 days. If the LI finds criteria violations, the Elections Panel must revise and republish within 30 days; the LI reviews the revision within 14 days. A map that passes LI review is certified and takes effect at the next general election. The EC administers all Territorial House elections through the NVS on the same schedule as State elections.</w:t>
       </w:r>
     </w:p>
     <w:p>
@@ -8069,7 +8069,7 @@
           <w:sz w:val="22"/>
           <w:szCs w:val="22"/>
         </w:rPr>
-        <w:t xml:space="preserve">When a House district seat falls vacant mid-term, the Electoral Commission administers a special election within 90 days. The replacement serves only the remainder of the original term. If fewer than 90 days remain in the term, the vacancy is not filled.</w:t>
+        <w:t xml:space="preserve">When a House district seat falls vacant mid-term, the Elections Panel of the Digital Infrastructure Commission administers a special election within 90 days. The replacement serves only the remainder of the original term. If fewer than 90 days remain in the term, the vacancy is not filled.</w:t>
       </w:r>
     </w:p>
     <w:p>

</xml_diff>